<commit_message>
feat(ml18): enable retraining and verify against the v4.2 code; align ml13 with the MLflow contract
</commit_message>
<xml_diff>
--- a/outputs/a18/a18_ficha_funcional.docx
+++ b/outputs/a18/a18_ficha_funcional.docx
@@ -578,7 +578,7 @@
           </w:tcPr>
           <w:p ns2:paraId="40956F30" ns2:textId="77777777">
             <w:r>
-              <w:t xml:space="preserve">Modo predict inline y predict batch (idéntico cálculo, solo cambia el transporte del panel -- JSON o CSV): se aporta un panel mensual de al menos 12 meses consecutivos por cada combinación CCAA-Producto que se quiera predecir (Fecha, CCAA, Producto, Poblacion, RentaHogar, CONSUMO X CAPITA, PENETRACION (%), PRECIO MEDIO KG). Opcionalmente se puede aportar también el histórico de las CCAA vecinas para que el lag espacial use su valor real; si no se aporta, el servicio usa el propio valor de la CCAA como alternativa razonable (mismo comportamiento que el código original, documentado explícitamente en la memoria). El servicio genera automáticamente la fila del mes siguiente a predecir -- no hace falta aportarla. No hay modo de reentrenamiento por usuario (ver limitaciones): el procedimiento de entrenamiento entregado siempre reentrena sobre el mismo histórico bundled del equipo de IA.</w:t>
+              <w:t xml:space="preserve">Modo predict inline y predict batch (idéntico cálculo, solo cambia el transporte del panel -- JSON o CSV): se aporta un panel mensual de al menos 12 meses consecutivos por cada combinación CCAA-Producto que se quiera predecir (Fecha, CCAA, Producto, Poblacion, RentaHogar, CONSUMO X CAPITA, PENETRACION (%), PRECIO MEDIO KG). Opcionalmente se puede aportar también el histórico de las CCAA vecinas para que el lag espacial use su valor real; si no se aporta, el servicio usa el propio valor de la CCAA como alternativa razonable (mismo comportamiento que el código original, documentado explícitamente en la memoria). El servicio genera automáticamente la fila del mes siguiente a predecir -- no hace falta aportarla. También admite reentrenamiento por usuario (/train): con un CSV en el mismo formato que el dataset de modelado del equipo de IA, repite su procedimiento completo (GRU desde cero, split temporal 70/15/15, parada temprana) y guarda el modelo resultante en MLflow, sin sustituir nunca el modelo base.</w:t>
             </w:r>
           </w:p>
         </w:tc>
@@ -1220,7 +1220,7 @@
     </w:p>
     <w:p ns2:paraId="36E72011" ns2:textId="77777777">
       <w:r>
-        <w:t xml:space="preserve">•  No permite reentrenamiento con datos propios del usuario -- solo existe el artefacto fijo entregado por el equipo de IA.</w:t>
+        <w:t xml:space="preserve">•  No sustituye automáticamente el modelo base al reentrenar: el modelo reentrenado solo se usa si se indica su run de MLflow.</w:t>
       </w:r>
     </w:p>
     <w:p ns2:paraId="36E72011" ns2:textId="77777777">
@@ -1870,7 +1870,7 @@
           </w:tcPr>
           <w:p ns2:paraId="4308B354" ns2:textId="77777777">
             <w:r>
-              <w:t xml:space="preserve">Sin reentrenamiento por usuario</w:t>
+              <w:t xml:space="preserve">Reentrenamiento: requisitos y coste</w:t>
             </w:r>
           </w:p>
         </w:tc>
@@ -1893,7 +1893,7 @@
           </w:tcPr>
           <w:p ns2:paraId="3FD46393" ns2:textId="77777777">
             <w:r>
-              <w:t xml:space="preserve">El procedimiento de entrenamiento entregado por el equipo de IA no acepta ningún dato de cliente: siempre reentrena sobre el mismo histórico fijo bundled, solo permite variar hiperparámetros editando config.yaml. El endpoint /train de este servicio devuelve explícitamente 'no soportado' (HTTP 501).</w:t>
+              <w:t xml:space="preserve">El reentrenamiento por usuario repite el procedimiento del equipo de IA desde cero (no ajuste fino) y necesita un histórico mensual en el formato del dataset de modelado con suficientes fechas para el split temporal 70/15/15 y más de 12 meses por combinación CCAA-Producto. Con el dataset completo tarda unos 2,5 minutos en CPU dentro de la petición. El modelo reentrenado solo se guarda en MLflow y se usa indicando su run; el modelo base no cambia.</w:t>
             </w:r>
           </w:p>
         </w:tc>

</xml_diff>